<commit_message>
docs: add a reference note to Table S2
Cites the methods the table describes without forcing a renumber of the main
list: Quantum ESPRESSO, PBE, ultrasoft, CI-NEB, UMA and ASE carry their existing
main-text numbers, while the three that have no number yet - PAW, Marzari-
Vanderbilt smearing, and the IDPP initial guess - are written out in full inside
the note, as SI table notes normally do. Pseudopotential libraries (GBRV for Li,
PSlibrary for N and C) are credited in a third line.

Co-Authored-By: Claude Opus 5 <noreply@anthropic.com>
Claude-Session: https://claude.ai/code/session_01L44TWYrHkcm4PH5ihWSSCw
</commit_message>
<xml_diff>
--- a/docs/manuscripts/Table_S2_DFT_parameters.docx
+++ b/docs/manuscripts/Table_S2_DFT_parameters.docx
@@ -1010,7 +1010,7 @@
     </w:p>
     <w:p>
       <w:pPr>
-        <w:spacing w:after="110" w:before="0" w:line="280"/>
+        <w:spacing w:after="160" w:before="0" w:line="280"/>
       </w:pPr>
       <w:r>
         <w:rPr>
@@ -1019,6 +1019,60 @@
           <w:szCs w:val="18"/>
         </w:rPr>
         <w:t xml:space="preserve">The LiC₆(0001) energies are DFT single points on machine-learned-potential geometries; because such potentials smooth the transition state, the LiC₆ barrier — and hence the barrier ratio quoted in the main text — is a conservative lower bound. The Li₃N(001) value of 0.118 eV agrees with the 0.133 eV reported for the same surface in ref. [54].</w:t>
+      </w:r>
+    </w:p>
+    <w:p>
+      <w:pPr>
+        <w:spacing w:after="60" w:before="0" w:line="280"/>
+      </w:pPr>
+      <w:r>
+        <w:rPr>
+          <w:rFonts w:ascii="Times New Roman" w:cs="Times New Roman" w:eastAsia="Times New Roman" w:hAnsi="Times New Roman"/>
+          <w:b/>
+          <w:bCs/>
+          <w:sz w:val="18"/>
+          <w:szCs w:val="18"/>
+        </w:rPr>
+        <w:t xml:space="preserve">References.</w:t>
+      </w:r>
+    </w:p>
+    <w:p>
+      <w:pPr>
+        <w:spacing w:after="80" w:before="0" w:line="280"/>
+      </w:pPr>
+      <w:r>
+        <w:rPr>
+          <w:rFonts w:ascii="Times New Roman" w:cs="Times New Roman" w:eastAsia="Times New Roman" w:hAnsi="Times New Roman"/>
+          <w:sz w:val="17"/>
+          <w:szCs w:val="17"/>
+        </w:rPr>
+        <w:t xml:space="preserve">Calculations were performed with Quantum ESPRESSO [43] using the PBE exchange–correlation functional [44] with ultrasoft [45] and projector augmented-wave pseudopotentials (P. E. Blöchl, Phys. Rev. B 50 (1994) 17953), and Marzari–Vanderbilt cold smearing (N. Marzari, D. Vanderbilt, A. De Vita, M. C. Payne, Phys. Rev. Lett. 82 (1999) 3296).</w:t>
+      </w:r>
+    </w:p>
+    <w:p>
+      <w:pPr>
+        <w:spacing w:after="80" w:before="0" w:line="280"/>
+      </w:pPr>
+      <w:r>
+        <w:rPr>
+          <w:rFonts w:ascii="Times New Roman" w:cs="Times New Roman" w:eastAsia="Times New Roman" w:hAnsi="Times New Roman"/>
+          <w:sz w:val="17"/>
+          <w:szCs w:val="17"/>
+        </w:rPr>
+        <w:t xml:space="preserve">The LiC₆(0001) migration path was obtained with the climbing-image nudged elastic band method [40] from an image-dependent pair potential initial guess (S. Smidstrup, A. Pedersen, K. Stokbro, H. Jónsson, J. Chem. Phys. 140 (2014) 214106), using the UMA machine-learned interatomic potential [41] as implemented in the Atomic Simulation Environment [42].</w:t>
+      </w:r>
+    </w:p>
+    <w:p>
+      <w:pPr>
+        <w:spacing w:after="110" w:before="0" w:line="280"/>
+      </w:pPr>
+      <w:r>
+        <w:rPr>
+          <w:rFonts w:ascii="Times New Roman" w:cs="Times New Roman" w:eastAsia="Times New Roman" w:hAnsi="Times New Roman"/>
+          <w:sz w:val="17"/>
+          <w:szCs w:val="17"/>
+        </w:rPr>
+        <w:t xml:space="preserve">Pseudopotentials: Li from the GBRV library (K. F. Garrity, J. W. Bennett, K. M. Rabe, D. Vanderbilt, Comput. Mater. Sci. 81 (2014) 446); N and C from PSlibrary (A. Dal Corso, Comput. Mater. Sci. 95 (2014) 337).</w:t>
       </w:r>
     </w:p>
     <w:sectPr>

</xml_diff>

<commit_message>
docs: Table S2 gets its own numbered reference list
Switched from inline citations to numbers marked in the table cells, with an
independent [1]-[12] list for the SI so the main-text list needs no renumbering.
Only the Kim reference overlaps, and its entry says so.

Order follows first appearance: code and functional, pseudopotentials and their
libraries, smearing, then the elastic-band chain on the LiC6 row. Added a
pseudopotential-library row rather than crowding four citations into one cell.

Co-Authored-By: Claude Opus 5 <noreply@anthropic.com>
Claude-Session: https://claude.ai/code/session_01L44TWYrHkcm4PH5ihWSSCw
</commit_message>
<xml_diff>
--- a/docs/manuscripts/Table_S2_DFT_parameters.docx
+++ b/docs/manuscripts/Table_S2_DFT_parameters.docx
@@ -171,7 +171,7 @@
                 <w:sz w:val="18"/>
                 <w:szCs w:val="18"/>
               </w:rPr>
-              <w:t xml:space="preserve">Quantum ESPRESSO 7.4.1 (pw.x); PBE</w:t>
+              <w:t xml:space="preserve">Quantum ESPRESSO 7.4.1 (pw.x) [1]; PBE [2]</w:t>
             </w:r>
           </w:p>
         </w:tc>
@@ -227,7 +227,7 @@
                 <w:sz w:val="18"/>
                 <w:szCs w:val="18"/>
               </w:rPr>
-              <w:t xml:space="preserve">Li, N: ultrasoft</w:t>
+              <w:t xml:space="preserve">Li, N: ultrasoft [3]</w:t>
             </w:r>
           </w:p>
         </w:tc>
@@ -254,7 +254,7 @@
                 <w:sz w:val="18"/>
                 <w:szCs w:val="18"/>
               </w:rPr>
-              <w:t xml:space="preserve">Li: ultrasoft; C: PAW</w:t>
+              <w:t xml:space="preserve">Li: ultrasoft [3]; C: PAW [4]</w:t>
             </w:r>
           </w:p>
         </w:tc>
@@ -283,7 +283,7 @@
                 <w:sz w:val="18"/>
                 <w:szCs w:val="18"/>
               </w:rPr>
-              <w:t xml:space="preserve">Cutoff (wavefunction / charge density)</w:t>
+              <w:t xml:space="preserve">Pseudopotential libraries</w:t>
             </w:r>
           </w:p>
         </w:tc>
@@ -310,7 +310,7 @@
                 <w:sz w:val="18"/>
                 <w:szCs w:val="18"/>
               </w:rPr>
-              <w:t xml:space="preserve">60 / 480 Ry</w:t>
+              <w:t xml:space="preserve">Li: GBRV [5]; N, C: PSlibrary [6]</w:t>
             </w:r>
           </w:p>
         </w:tc>
@@ -339,7 +339,7 @@
                 <w:sz w:val="18"/>
                 <w:szCs w:val="18"/>
               </w:rPr>
-              <w:t xml:space="preserve">k-point mesh</w:t>
+              <w:t xml:space="preserve">Cutoff (wavefunction / charge density)</w:t>
             </w:r>
           </w:p>
         </w:tc>
@@ -366,7 +366,7 @@
                 <w:sz w:val="18"/>
                 <w:szCs w:val="18"/>
               </w:rPr>
-              <w:t xml:space="preserve">2 × 2 × 1 (Γ-centred)</w:t>
+              <w:t xml:space="preserve">60 / 480 Ry</w:t>
             </w:r>
           </w:p>
         </w:tc>
@@ -395,7 +395,7 @@
                 <w:sz w:val="18"/>
                 <w:szCs w:val="18"/>
               </w:rPr>
-              <w:t xml:space="preserve">Smearing</w:t>
+              <w:t xml:space="preserve">k-point mesh</w:t>
             </w:r>
           </w:p>
         </w:tc>
@@ -422,7 +422,7 @@
                 <w:sz w:val="18"/>
                 <w:szCs w:val="18"/>
               </w:rPr>
-              <w:t xml:space="preserve">Marzari–Vanderbilt, 0.01 Ry</w:t>
+              <w:t xml:space="preserve">2 × 2 × 1 (Γ-centred)</w:t>
             </w:r>
           </w:p>
         </w:tc>
@@ -451,7 +451,7 @@
                 <w:sz w:val="18"/>
                 <w:szCs w:val="18"/>
               </w:rPr>
-              <w:t xml:space="preserve">Convergence (SCF / force)</w:t>
+              <w:t xml:space="preserve">Smearing</w:t>
             </w:r>
           </w:p>
         </w:tc>
@@ -478,7 +478,7 @@
                 <w:sz w:val="18"/>
                 <w:szCs w:val="18"/>
               </w:rPr>
-              <w:t xml:space="preserve">1 × 10⁻⁶ Ry / 1 × 10⁻³ Ry bohr⁻¹</w:t>
+              <w:t xml:space="preserve">Marzari–Vanderbilt, 0.01 Ry [7]</w:t>
             </w:r>
           </w:p>
         </w:tc>
@@ -507,61 +507,34 @@
                 <w:sz w:val="18"/>
                 <w:szCs w:val="18"/>
               </w:rPr>
-              <w:t xml:space="preserve">Slab model</w:t>
-            </w:r>
-          </w:p>
-        </w:tc>
-        <w:tc>
-          <w:tcPr>
-            <w:tcW w:type="dxa" w:w="3540"/>
-            <w:gridSpan w:val="1"/>
-            <w:tcMar>
-              <w:top w:type="dxa" w:w="50"/>
-              <w:left w:type="dxa" w:w="100"/>
-              <w:bottom w:type="dxa" w:w="50"/>
-              <w:right w:type="dxa" w:w="100"/>
-            </w:tcMar>
-          </w:tcPr>
-          <w:p>
-            <w:pPr>
-              <w:spacing w:after="0" w:before="0"/>
-            </w:pPr>
-            <w:r>
-              <w:rPr>
-                <w:rFonts w:ascii="Times New Roman" w:cs="Times New Roman" w:eastAsia="Times New Roman" w:hAnsi="Times New Roman"/>
-                <w:b w:val="false"/>
-                <w:bCs w:val="false"/>
-                <w:sz w:val="18"/>
-                <w:szCs w:val="18"/>
-              </w:rPr>
-              <w:t xml:space="preserve">α-Li₃N, 3 × 3; four Li₂N and three Li planes, Li₂N (N-exposed) termination; 135 atoms + 1 Li adatom</w:t>
-            </w:r>
-          </w:p>
-        </w:tc>
-        <w:tc>
-          <w:tcPr>
-            <w:tcW w:type="dxa" w:w="3540"/>
-            <w:gridSpan w:val="1"/>
-            <w:tcMar>
-              <w:top w:type="dxa" w:w="50"/>
-              <w:left w:type="dxa" w:w="100"/>
-              <w:bottom w:type="dxa" w:w="50"/>
-              <w:right w:type="dxa" w:w="100"/>
-            </w:tcMar>
-          </w:tcPr>
-          <w:p>
-            <w:pPr>
-              <w:spacing w:after="0" w:before="0"/>
-            </w:pPr>
-            <w:r>
-              <w:rPr>
-                <w:rFonts w:ascii="Times New Roman" w:cs="Times New Roman" w:eastAsia="Times New Roman" w:hAnsi="Times New Roman"/>
-                <w:b w:val="false"/>
-                <w:bCs w:val="false"/>
-                <w:sz w:val="18"/>
-                <w:szCs w:val="18"/>
-              </w:rPr>
-              <w:t xml:space="preserve">Stage-1 LiC₆, √3 × √3 R30°, 2 × 2 × 2; graphene-terminated; 108 atoms + 1 Li adatom</w:t>
+              <w:t xml:space="preserve">Convergence (SCF / force)</w:t>
+            </w:r>
+          </w:p>
+        </w:tc>
+        <w:tc>
+          <w:tcPr>
+            <w:tcW w:type="dxa" w:w="7080"/>
+            <w:gridSpan w:val="2"/>
+            <w:tcMar>
+              <w:top w:type="dxa" w:w="50"/>
+              <w:left w:type="dxa" w:w="100"/>
+              <w:bottom w:type="dxa" w:w="50"/>
+              <w:right w:type="dxa" w:w="100"/>
+            </w:tcMar>
+          </w:tcPr>
+          <w:p>
+            <w:pPr>
+              <w:spacing w:after="0" w:before="0"/>
+            </w:pPr>
+            <w:r>
+              <w:rPr>
+                <w:rFonts w:ascii="Times New Roman" w:cs="Times New Roman" w:eastAsia="Times New Roman" w:hAnsi="Times New Roman"/>
+                <w:b w:val="false"/>
+                <w:bCs w:val="false"/>
+                <w:sz w:val="18"/>
+                <w:szCs w:val="18"/>
+              </w:rPr>
+              <w:t xml:space="preserve">1 × 10⁻⁶ Ry / 1 × 10⁻³ Ry bohr⁻¹</w:t>
             </w:r>
           </w:p>
         </w:tc>
@@ -590,7 +563,7 @@
                 <w:sz w:val="18"/>
                 <w:szCs w:val="18"/>
               </w:rPr>
-              <w:t xml:space="preserve">Cell / vacuum</w:t>
+              <w:t xml:space="preserve">Slab model</w:t>
             </w:r>
           </w:p>
         </w:tc>
@@ -617,7 +590,7 @@
                 <w:sz w:val="18"/>
                 <w:szCs w:val="18"/>
               </w:rPr>
-              <w:t xml:space="preserve">a = b = 10.95 Å, c = 28.545 Å, γ = 120°; 15.7 Å vacuum</w:t>
+              <w:t xml:space="preserve">α-Li₃N, 3 × 3; four Li₂N and three Li planes, Li₂N (N-exposed) termination; 135 atoms + 1 Li adatom</w:t>
             </w:r>
           </w:p>
         </w:tc>
@@ -644,7 +617,7 @@
                 <w:sz w:val="18"/>
                 <w:szCs w:val="18"/>
               </w:rPr>
-              <w:t xml:space="preserve">15 Å vacuum</w:t>
+              <w:t xml:space="preserve">Stage-1 LiC₆, √3 × √3 R30°, 2 × 2 × 2; graphene-terminated; 108 atoms + 1 Li adatom</w:t>
             </w:r>
           </w:p>
         </w:tc>
@@ -673,7 +646,7 @@
                 <w:sz w:val="18"/>
                 <w:szCs w:val="18"/>
               </w:rPr>
-              <w:t xml:space="preserve">Fixed atoms</w:t>
+              <w:t xml:space="preserve">Cell / vacuum</w:t>
             </w:r>
           </w:p>
         </w:tc>
@@ -700,7 +673,7 @@
                 <w:sz w:val="18"/>
                 <w:szCs w:val="18"/>
               </w:rPr>
-              <w:t xml:space="preserve">Bottom two Li₂N/Li bilayers</w:t>
+              <w:t xml:space="preserve">a = b = 10.95 Å, c = 28.545 Å, γ = 120°; 15.7 Å vacuum</w:t>
             </w:r>
           </w:p>
         </w:tc>
@@ -727,7 +700,7 @@
                 <w:sz w:val="18"/>
                 <w:szCs w:val="18"/>
               </w:rPr>
-              <w:t xml:space="preserve">Bottom 50 % of the slab</w:t>
+              <w:t xml:space="preserve">15 Å vacuum</w:t>
             </w:r>
           </w:p>
         </w:tc>
@@ -756,6 +729,89 @@
                 <w:sz w:val="18"/>
                 <w:szCs w:val="18"/>
               </w:rPr>
+              <w:t xml:space="preserve">Fixed atoms</w:t>
+            </w:r>
+          </w:p>
+        </w:tc>
+        <w:tc>
+          <w:tcPr>
+            <w:tcW w:type="dxa" w:w="3540"/>
+            <w:gridSpan w:val="1"/>
+            <w:tcMar>
+              <w:top w:type="dxa" w:w="50"/>
+              <w:left w:type="dxa" w:w="100"/>
+              <w:bottom w:type="dxa" w:w="50"/>
+              <w:right w:type="dxa" w:w="100"/>
+            </w:tcMar>
+          </w:tcPr>
+          <w:p>
+            <w:pPr>
+              <w:spacing w:after="0" w:before="0"/>
+            </w:pPr>
+            <w:r>
+              <w:rPr>
+                <w:rFonts w:ascii="Times New Roman" w:cs="Times New Roman" w:eastAsia="Times New Roman" w:hAnsi="Times New Roman"/>
+                <w:b w:val="false"/>
+                <w:bCs w:val="false"/>
+                <w:sz w:val="18"/>
+                <w:szCs w:val="18"/>
+              </w:rPr>
+              <w:t xml:space="preserve">Bottom two Li₂N/Li bilayers</w:t>
+            </w:r>
+          </w:p>
+        </w:tc>
+        <w:tc>
+          <w:tcPr>
+            <w:tcW w:type="dxa" w:w="3540"/>
+            <w:gridSpan w:val="1"/>
+            <w:tcMar>
+              <w:top w:type="dxa" w:w="50"/>
+              <w:left w:type="dxa" w:w="100"/>
+              <w:bottom w:type="dxa" w:w="50"/>
+              <w:right w:type="dxa" w:w="100"/>
+            </w:tcMar>
+          </w:tcPr>
+          <w:p>
+            <w:pPr>
+              <w:spacing w:after="0" w:before="0"/>
+            </w:pPr>
+            <w:r>
+              <w:rPr>
+                <w:rFonts w:ascii="Times New Roman" w:cs="Times New Roman" w:eastAsia="Times New Roman" w:hAnsi="Times New Roman"/>
+                <w:b w:val="false"/>
+                <w:bCs w:val="false"/>
+                <w:sz w:val="18"/>
+                <w:szCs w:val="18"/>
+              </w:rPr>
+              <w:t xml:space="preserve">Bottom 50 % of the slab</w:t>
+            </w:r>
+          </w:p>
+        </w:tc>
+      </w:tr>
+      <w:tr>
+        <w:tc>
+          <w:tcPr>
+            <w:tcW w:type="dxa" w:w="2280"/>
+            <w:gridSpan w:val="1"/>
+            <w:tcMar>
+              <w:top w:type="dxa" w:w="50"/>
+              <w:left w:type="dxa" w:w="100"/>
+              <w:bottom w:type="dxa" w:w="50"/>
+              <w:right w:type="dxa" w:w="100"/>
+            </w:tcMar>
+          </w:tcPr>
+          <w:p>
+            <w:pPr>
+              <w:spacing w:after="0" w:before="0"/>
+            </w:pPr>
+            <w:r>
+              <w:rPr>
+                <w:rFonts w:ascii="Times New Roman" w:cs="Times New Roman" w:eastAsia="Times New Roman" w:hAnsi="Times New Roman"/>
+                <w:b w:val="false"/>
+                <w:bCs w:val="false"/>
+                <w:sz w:val="18"/>
+                <w:szCs w:val="18"/>
+              </w:rPr>
               <w:t xml:space="preserve">Migration path</w:t>
             </w:r>
           </w:p>
@@ -810,7 +866,7 @@
                 <w:sz w:val="18"/>
                 <w:szCs w:val="18"/>
               </w:rPr>
-              <w:t xml:space="preserve">CI-NEB with the UMA-oc20 machine-learned potential (7 images, IDPP initial path, 0.05 eV Å⁻¹), then DFT single-point energies on those geometries</w:t>
+              <w:t xml:space="preserve">CI-NEB [8] with the UMA-oc20 machine-learned potential [10] (7 images, IDPP initial path [9], 0.05 eV Å⁻¹) as implemented in ASE [11], then DFT single-point energies on those geometries</w:t>
             </w:r>
           </w:p>
         </w:tc>
@@ -1018,12 +1074,12 @@
           <w:sz w:val="18"/>
           <w:szCs w:val="18"/>
         </w:rPr>
-        <w:t xml:space="preserve">The LiC₆(0001) energies are DFT single points on machine-learned-potential geometries; because such potentials smooth the transition state, the LiC₆ barrier — and hence the barrier ratio quoted in the main text — is a conservative lower bound. The Li₃N(001) value of 0.118 eV agrees with the 0.133 eV reported for the same surface in ref. [54].</w:t>
-      </w:r>
-    </w:p>
-    <w:p>
-      <w:pPr>
-        <w:spacing w:after="60" w:before="0" w:line="280"/>
+        <w:t xml:space="preserve">The LiC₆(0001) energies are DFT single points on machine-learned-potential geometries; because such potentials smooth the transition state, the LiC₆ barrier — and hence the barrier ratio quoted in the main text — is a conservative lower bound. The Li₃N(001) value of 0.118 eV agrees with the 0.133 eV reported for the same surface in ref. [12].</w:t>
+      </w:r>
+    </w:p>
+    <w:p>
+      <w:pPr>
+        <w:spacing w:after="80" w:before="0" w:line="280"/>
       </w:pPr>
       <w:r>
         <w:rPr>
@@ -1033,46 +1089,163 @@
           <w:sz w:val="18"/>
           <w:szCs w:val="18"/>
         </w:rPr>
-        <w:t xml:space="preserve">References.</w:t>
-      </w:r>
-    </w:p>
-    <w:p>
-      <w:pPr>
-        <w:spacing w:after="80" w:before="0" w:line="280"/>
+        <w:t xml:space="preserve">References</w:t>
+      </w:r>
+    </w:p>
+    <w:p>
+      <w:pPr>
+        <w:spacing w:after="40" w:before="0" w:line="280"/>
       </w:pPr>
       <w:r>
         <w:rPr>
           <w:rFonts w:ascii="Times New Roman" w:cs="Times New Roman" w:eastAsia="Times New Roman" w:hAnsi="Times New Roman"/>
-          <w:sz w:val="17"/>
-          <w:szCs w:val="17"/>
-        </w:rPr>
-        <w:t xml:space="preserve">Calculations were performed with Quantum ESPRESSO [43] using the PBE exchange–correlation functional [44] with ultrasoft [45] and projector augmented-wave pseudopotentials (P. E. Blöchl, Phys. Rev. B 50 (1994) 17953), and Marzari–Vanderbilt cold smearing (N. Marzari, D. Vanderbilt, A. De Vita, M. C. Payne, Phys. Rev. Lett. 82 (1999) 3296).</w:t>
-      </w:r>
-    </w:p>
-    <w:p>
-      <w:pPr>
-        <w:spacing w:after="80" w:before="0" w:line="280"/>
+          <w:sz w:val="16"/>
+          <w:szCs w:val="16"/>
+        </w:rPr>
+        <w:t xml:space="preserve">[1] P. Giannozzi, S. Baroni, N. Bonini, M. Calandra, R. Car, C. Cavazzoni, D. Ceresoli, G. L. Chiarotti, M. Cococcioni, I. Dabo, A. Dal Corso, S. de Gironcoli, S. Fabris, G. Fratesi, R. Gebauer, U. Gerstmann, C. Gougoussis, A. Kokalj, M. Lazzeri, L. Martin-Samos, N. Marzari, F. Mauri, R. Mazzarello, S. Paolini, A. Pasquarello, L. Paulatto, C. Sbraccia, S. Scandolo, G. Sclauzero, A. P. Seitsonen, A. Smogunov, P. Umari, R. M. Wentzcovitch, QUANTUM ESPRESSO: a modular and open-source software project for quantum simulations of materials, J. Phys.: Condens. Matter 21 (2009) 395502. https://doi.org/10.1088/0953-8984/21/39/395502.</w:t>
+      </w:r>
+    </w:p>
+    <w:p>
+      <w:pPr>
+        <w:spacing w:after="40" w:before="0" w:line="280"/>
       </w:pPr>
       <w:r>
         <w:rPr>
           <w:rFonts w:ascii="Times New Roman" w:cs="Times New Roman" w:eastAsia="Times New Roman" w:hAnsi="Times New Roman"/>
-          <w:sz w:val="17"/>
-          <w:szCs w:val="17"/>
-        </w:rPr>
-        <w:t xml:space="preserve">The LiC₆(0001) migration path was obtained with the climbing-image nudged elastic band method [40] from an image-dependent pair potential initial guess (S. Smidstrup, A. Pedersen, K. Stokbro, H. Jónsson, J. Chem. Phys. 140 (2014) 214106), using the UMA machine-learned interatomic potential [41] as implemented in the Atomic Simulation Environment [42].</w:t>
-      </w:r>
-    </w:p>
-    <w:p>
-      <w:pPr>
-        <w:spacing w:after="110" w:before="0" w:line="280"/>
+          <w:sz w:val="16"/>
+          <w:szCs w:val="16"/>
+        </w:rPr>
+        <w:t xml:space="preserve">[2] J. P. Perdew, K. Burke, M. Ernzerhof, Generalized gradient approximation made simple, Phys. Rev. Lett. 77 (1996) 3865–3868. https://doi.org/10.1103/PhysRevLett.77.3865.</w:t>
+      </w:r>
+    </w:p>
+    <w:p>
+      <w:pPr>
+        <w:spacing w:after="40" w:before="0" w:line="280"/>
       </w:pPr>
       <w:r>
         <w:rPr>
           <w:rFonts w:ascii="Times New Roman" w:cs="Times New Roman" w:eastAsia="Times New Roman" w:hAnsi="Times New Roman"/>
-          <w:sz w:val="17"/>
-          <w:szCs w:val="17"/>
-        </w:rPr>
-        <w:t xml:space="preserve">Pseudopotentials: Li from the GBRV library (K. F. Garrity, J. W. Bennett, K. M. Rabe, D. Vanderbilt, Comput. Mater. Sci. 81 (2014) 446); N and C from PSlibrary (A. Dal Corso, Comput. Mater. Sci. 95 (2014) 337).</w:t>
+          <w:sz w:val="16"/>
+          <w:szCs w:val="16"/>
+        </w:rPr>
+        <w:t xml:space="preserve">[3] D. Vanderbilt, Soft self-consistent pseudopotentials in a generalized eigenvalue formalism, Phys. Rev. B 41 (1990) 7892–7895. https://doi.org/10.1103/PhysRevB.41.7892.</w:t>
+      </w:r>
+    </w:p>
+    <w:p>
+      <w:pPr>
+        <w:spacing w:after="40" w:before="0" w:line="280"/>
+      </w:pPr>
+      <w:r>
+        <w:rPr>
+          <w:rFonts w:ascii="Times New Roman" w:cs="Times New Roman" w:eastAsia="Times New Roman" w:hAnsi="Times New Roman"/>
+          <w:sz w:val="16"/>
+          <w:szCs w:val="16"/>
+        </w:rPr>
+        <w:t xml:space="preserve">[4] P. E. Blöchl, Projector augmented-wave method, Phys. Rev. B 50 (1994) 17953–17979. https://doi.org/10.1103/PhysRevB.50.17953.</w:t>
+      </w:r>
+    </w:p>
+    <w:p>
+      <w:pPr>
+        <w:spacing w:after="40" w:before="0" w:line="280"/>
+      </w:pPr>
+      <w:r>
+        <w:rPr>
+          <w:rFonts w:ascii="Times New Roman" w:cs="Times New Roman" w:eastAsia="Times New Roman" w:hAnsi="Times New Roman"/>
+          <w:sz w:val="16"/>
+          <w:szCs w:val="16"/>
+        </w:rPr>
+        <w:t xml:space="preserve">[5] K. F. Garrity, J. W. Bennett, K. M. Rabe, D. Vanderbilt, Pseudopotentials for high-throughput DFT calculations, Comput. Mater. Sci. 81 (2014) 446–452. https://doi.org/10.1016/j.commatsci.2013.08.053.</w:t>
+      </w:r>
+    </w:p>
+    <w:p>
+      <w:pPr>
+        <w:spacing w:after="40" w:before="0" w:line="280"/>
+      </w:pPr>
+      <w:r>
+        <w:rPr>
+          <w:rFonts w:ascii="Times New Roman" w:cs="Times New Roman" w:eastAsia="Times New Roman" w:hAnsi="Times New Roman"/>
+          <w:sz w:val="16"/>
+          <w:szCs w:val="16"/>
+        </w:rPr>
+        <w:t xml:space="preserve">[6] A. Dal Corso, Pseudopotentials periodic table: From H to Pu, Comput. Mater. Sci. 95 (2014) 337–350. https://doi.org/10.1016/j.commatsci.2014.07.043.</w:t>
+      </w:r>
+    </w:p>
+    <w:p>
+      <w:pPr>
+        <w:spacing w:after="40" w:before="0" w:line="280"/>
+      </w:pPr>
+      <w:r>
+        <w:rPr>
+          <w:rFonts w:ascii="Times New Roman" w:cs="Times New Roman" w:eastAsia="Times New Roman" w:hAnsi="Times New Roman"/>
+          <w:sz w:val="16"/>
+          <w:szCs w:val="16"/>
+        </w:rPr>
+        <w:t xml:space="preserve">[7] N. Marzari, D. Vanderbilt, A. De Vita, M. C. Payne, Thermal contraction and disordering of the Al(110) surface, Phys. Rev. Lett. 82 (1999) 3296–3299. https://doi.org/10.1103/PhysRevLett.82.3296.</w:t>
+      </w:r>
+    </w:p>
+    <w:p>
+      <w:pPr>
+        <w:spacing w:after="40" w:before="0" w:line="280"/>
+      </w:pPr>
+      <w:r>
+        <w:rPr>
+          <w:rFonts w:ascii="Times New Roman" w:cs="Times New Roman" w:eastAsia="Times New Roman" w:hAnsi="Times New Roman"/>
+          <w:sz w:val="16"/>
+          <w:szCs w:val="16"/>
+        </w:rPr>
+        <w:t xml:space="preserve">[8] G. Henkelman, B. P. Uberuaga, H. Jónsson, A climbing image nudged elastic band method for finding saddle points and minimum energy paths, J. Chem. Phys. 113 (2000) 9901–9904. https://doi.org/10.1063/1.1329672.</w:t>
+      </w:r>
+    </w:p>
+    <w:p>
+      <w:pPr>
+        <w:spacing w:after="40" w:before="0" w:line="280"/>
+      </w:pPr>
+      <w:r>
+        <w:rPr>
+          <w:rFonts w:ascii="Times New Roman" w:cs="Times New Roman" w:eastAsia="Times New Roman" w:hAnsi="Times New Roman"/>
+          <w:sz w:val="16"/>
+          <w:szCs w:val="16"/>
+        </w:rPr>
+        <w:t xml:space="preserve">[9] S. Smidstrup, A. Pedersen, K. Stokbro, H. Jónsson, Improved initial guess for minimum energy path calculations, J. Chem. Phys. 140 (2014) 214106. https://doi.org/10.1063/1.4878664.</w:t>
+      </w:r>
+    </w:p>
+    <w:p>
+      <w:pPr>
+        <w:spacing w:after="40" w:before="0" w:line="280"/>
+      </w:pPr>
+      <w:r>
+        <w:rPr>
+          <w:rFonts w:ascii="Times New Roman" w:cs="Times New Roman" w:eastAsia="Times New Roman" w:hAnsi="Times New Roman"/>
+          <w:sz w:val="16"/>
+          <w:szCs w:val="16"/>
+        </w:rPr>
+        <w:t xml:space="preserve">[10] B. M. Wood, M. Dzamba, X. Fu, M. Gao, M. Shuaibi, L. Barroso-Luque, K. Abdelmaqsoud, V. Gharakhanyan, J. R. Kitchin, D. S. Levine, K. Michel, A. Sriram, T. S. Cohen, A. Das, S. J. Sahoo, A. Rizvi, Z. W. Ulissi, C. L. Zitnick, UMA: A family of universal models for atoms, Adv. Neural Inf. Process. Syst. 38 (2025) 143528–143564. https://doi.org/10.52202/085713-4310.</w:t>
+      </w:r>
+    </w:p>
+    <w:p>
+      <w:pPr>
+        <w:spacing w:after="40" w:before="0" w:line="280"/>
+      </w:pPr>
+      <w:r>
+        <w:rPr>
+          <w:rFonts w:ascii="Times New Roman" w:cs="Times New Roman" w:eastAsia="Times New Roman" w:hAnsi="Times New Roman"/>
+          <w:sz w:val="16"/>
+          <w:szCs w:val="16"/>
+        </w:rPr>
+        <w:t xml:space="preserve">[11] A. H. Larsen, J. J. Mortensen, J. Blomqvist, I. E. Castelli, R. Christensen, M. Dułak, J. Friis, M. N. Groves, B. Hammer, C. Hargus, E. D. Hermes, P. C. Jennings, P. B. Jensen, J. Kermode, J. R. Kitchin, E. L. Kolsbjerg, J. Kubal, K. Kaasbjerg, S. Lysgaard, J. B. Maronsson, T. Maxson, T. Olsen, L. Pastewka, A. Peterson, C. Rostgaard, J. Schiøtz, O. Schütt, M. Strange, K. S. Thygesen, T. Vegge, L. Vilhelmsen, M. Walter, Z. Zeng, K. W. Jacobsen, The atomic simulation environment—a Python library for working with atoms, J. Phys.: Condens. Matter 29 (2017) 273002. https://doi.org/10.1088/1361-648X/aa680e.</w:t>
+      </w:r>
+    </w:p>
+    <w:p>
+      <w:pPr>
+        <w:spacing w:after="40" w:before="0" w:line="280"/>
+      </w:pPr>
+      <w:r>
+        <w:rPr>
+          <w:rFonts w:ascii="Times New Roman" w:cs="Times New Roman" w:eastAsia="Times New Roman" w:hAnsi="Times New Roman"/>
+          <w:sz w:val="16"/>
+          <w:szCs w:val="16"/>
+        </w:rPr>
+        <w:t xml:space="preserve">[12] M. S. Kim, Z. Zhang, J. Wang, S. T. Oyakhire, S. C. Kim, Z. Yu, Y. Chen, D. T. Boyle, Y. Ye, Z. Huang, W. Zhang, R. Xu, P. Sayavong, S. F. Bent, J. Qin, Z. Bao, Y. Cui, Revealing the multifunctions of Li3N in the suspension electrolyte for lithium metal batteries, ACS Nano 17 (2023) 3168–3180. https://doi.org/10.1021/acsnano.2c12470. (= ref. [54] of the main text)</w:t>
       </w:r>
     </w:p>
     <w:sectPr>

</xml_diff>

<commit_message>
docs: drop the pseudopotential citations from Table S2
The libraries row and the ultrasoft/PAW citations came out; 'ultrasoft' and
'PAW' are standard enough to stand unreferenced in a parameter table, and four
citations on one row was noise. Remaining references renumbered [1]-[8].

Co-Authored-By: Claude Opus 5 <noreply@anthropic.com>
Claude-Session: https://claude.ai/code/session_01L44TWYrHkcm4PH5ihWSSCw
</commit_message>
<xml_diff>
--- a/docs/manuscripts/Table_S2_DFT_parameters.docx
+++ b/docs/manuscripts/Table_S2_DFT_parameters.docx
@@ -227,7 +227,7 @@
                 <w:sz w:val="18"/>
                 <w:szCs w:val="18"/>
               </w:rPr>
-              <w:t xml:space="preserve">Li, N: ultrasoft [3]</w:t>
+              <w:t xml:space="preserve">Li, N: ultrasoft</w:t>
             </w:r>
           </w:p>
         </w:tc>
@@ -254,7 +254,7 @@
                 <w:sz w:val="18"/>
                 <w:szCs w:val="18"/>
               </w:rPr>
-              <w:t xml:space="preserve">Li: ultrasoft [3]; C: PAW [4]</w:t>
+              <w:t xml:space="preserve">Li: ultrasoft; C: PAW</w:t>
             </w:r>
           </w:p>
         </w:tc>
@@ -283,7 +283,7 @@
                 <w:sz w:val="18"/>
                 <w:szCs w:val="18"/>
               </w:rPr>
-              <w:t xml:space="preserve">Pseudopotential libraries</w:t>
+              <w:t xml:space="preserve">Cutoff (wavefunction / charge density)</w:t>
             </w:r>
           </w:p>
         </w:tc>
@@ -310,7 +310,7 @@
                 <w:sz w:val="18"/>
                 <w:szCs w:val="18"/>
               </w:rPr>
-              <w:t xml:space="preserve">Li: GBRV [5]; N, C: PSlibrary [6]</w:t>
+              <w:t xml:space="preserve">60 / 480 Ry</w:t>
             </w:r>
           </w:p>
         </w:tc>
@@ -339,7 +339,7 @@
                 <w:sz w:val="18"/>
                 <w:szCs w:val="18"/>
               </w:rPr>
-              <w:t xml:space="preserve">Cutoff (wavefunction / charge density)</w:t>
+              <w:t xml:space="preserve">k-point mesh</w:t>
             </w:r>
           </w:p>
         </w:tc>
@@ -366,7 +366,7 @@
                 <w:sz w:val="18"/>
                 <w:szCs w:val="18"/>
               </w:rPr>
-              <w:t xml:space="preserve">60 / 480 Ry</w:t>
+              <w:t xml:space="preserve">2 × 2 × 1 (Γ-centred)</w:t>
             </w:r>
           </w:p>
         </w:tc>
@@ -395,7 +395,7 @@
                 <w:sz w:val="18"/>
                 <w:szCs w:val="18"/>
               </w:rPr>
-              <w:t xml:space="preserve">k-point mesh</w:t>
+              <w:t xml:space="preserve">Smearing</w:t>
             </w:r>
           </w:p>
         </w:tc>
@@ -422,7 +422,7 @@
                 <w:sz w:val="18"/>
                 <w:szCs w:val="18"/>
               </w:rPr>
-              <w:t xml:space="preserve">2 × 2 × 1 (Γ-centred)</w:t>
+              <w:t xml:space="preserve">Marzari–Vanderbilt, 0.01 Ry [3]</w:t>
             </w:r>
           </w:p>
         </w:tc>
@@ -451,7 +451,7 @@
                 <w:sz w:val="18"/>
                 <w:szCs w:val="18"/>
               </w:rPr>
-              <w:t xml:space="preserve">Smearing</w:t>
+              <w:t xml:space="preserve">Convergence (SCF / force)</w:t>
             </w:r>
           </w:p>
         </w:tc>
@@ -478,7 +478,7 @@
                 <w:sz w:val="18"/>
                 <w:szCs w:val="18"/>
               </w:rPr>
-              <w:t xml:space="preserve">Marzari–Vanderbilt, 0.01 Ry [7]</w:t>
+              <w:t xml:space="preserve">1 × 10⁻⁶ Ry / 1 × 10⁻³ Ry bohr⁻¹</w:t>
             </w:r>
           </w:p>
         </w:tc>
@@ -507,34 +507,61 @@
                 <w:sz w:val="18"/>
                 <w:szCs w:val="18"/>
               </w:rPr>
-              <w:t xml:space="preserve">Convergence (SCF / force)</w:t>
-            </w:r>
-          </w:p>
-        </w:tc>
-        <w:tc>
-          <w:tcPr>
-            <w:tcW w:type="dxa" w:w="7080"/>
-            <w:gridSpan w:val="2"/>
-            <w:tcMar>
-              <w:top w:type="dxa" w:w="50"/>
-              <w:left w:type="dxa" w:w="100"/>
-              <w:bottom w:type="dxa" w:w="50"/>
-              <w:right w:type="dxa" w:w="100"/>
-            </w:tcMar>
-          </w:tcPr>
-          <w:p>
-            <w:pPr>
-              <w:spacing w:after="0" w:before="0"/>
-            </w:pPr>
-            <w:r>
-              <w:rPr>
-                <w:rFonts w:ascii="Times New Roman" w:cs="Times New Roman" w:eastAsia="Times New Roman" w:hAnsi="Times New Roman"/>
-                <w:b w:val="false"/>
-                <w:bCs w:val="false"/>
-                <w:sz w:val="18"/>
-                <w:szCs w:val="18"/>
-              </w:rPr>
-              <w:t xml:space="preserve">1 × 10⁻⁶ Ry / 1 × 10⁻³ Ry bohr⁻¹</w:t>
+              <w:t xml:space="preserve">Slab model</w:t>
+            </w:r>
+          </w:p>
+        </w:tc>
+        <w:tc>
+          <w:tcPr>
+            <w:tcW w:type="dxa" w:w="3540"/>
+            <w:gridSpan w:val="1"/>
+            <w:tcMar>
+              <w:top w:type="dxa" w:w="50"/>
+              <w:left w:type="dxa" w:w="100"/>
+              <w:bottom w:type="dxa" w:w="50"/>
+              <w:right w:type="dxa" w:w="100"/>
+            </w:tcMar>
+          </w:tcPr>
+          <w:p>
+            <w:pPr>
+              <w:spacing w:after="0" w:before="0"/>
+            </w:pPr>
+            <w:r>
+              <w:rPr>
+                <w:rFonts w:ascii="Times New Roman" w:cs="Times New Roman" w:eastAsia="Times New Roman" w:hAnsi="Times New Roman"/>
+                <w:b w:val="false"/>
+                <w:bCs w:val="false"/>
+                <w:sz w:val="18"/>
+                <w:szCs w:val="18"/>
+              </w:rPr>
+              <w:t xml:space="preserve">α-Li₃N, 3 × 3; four Li₂N and three Li planes, Li₂N (N-exposed) termination; 135 atoms + 1 Li adatom</w:t>
+            </w:r>
+          </w:p>
+        </w:tc>
+        <w:tc>
+          <w:tcPr>
+            <w:tcW w:type="dxa" w:w="3540"/>
+            <w:gridSpan w:val="1"/>
+            <w:tcMar>
+              <w:top w:type="dxa" w:w="50"/>
+              <w:left w:type="dxa" w:w="100"/>
+              <w:bottom w:type="dxa" w:w="50"/>
+              <w:right w:type="dxa" w:w="100"/>
+            </w:tcMar>
+          </w:tcPr>
+          <w:p>
+            <w:pPr>
+              <w:spacing w:after="0" w:before="0"/>
+            </w:pPr>
+            <w:r>
+              <w:rPr>
+                <w:rFonts w:ascii="Times New Roman" w:cs="Times New Roman" w:eastAsia="Times New Roman" w:hAnsi="Times New Roman"/>
+                <w:b w:val="false"/>
+                <w:bCs w:val="false"/>
+                <w:sz w:val="18"/>
+                <w:szCs w:val="18"/>
+              </w:rPr>
+              <w:t xml:space="preserve">Stage-1 LiC₆, √3 × √3 R30°, 2 × 2 × 2; graphene-terminated; 108 atoms + 1 Li adatom</w:t>
             </w:r>
           </w:p>
         </w:tc>
@@ -563,7 +590,7 @@
                 <w:sz w:val="18"/>
                 <w:szCs w:val="18"/>
               </w:rPr>
-              <w:t xml:space="preserve">Slab model</w:t>
+              <w:t xml:space="preserve">Cell / vacuum</w:t>
             </w:r>
           </w:p>
         </w:tc>
@@ -590,7 +617,7 @@
                 <w:sz w:val="18"/>
                 <w:szCs w:val="18"/>
               </w:rPr>
-              <w:t xml:space="preserve">α-Li₃N, 3 × 3; four Li₂N and three Li planes, Li₂N (N-exposed) termination; 135 atoms + 1 Li adatom</w:t>
+              <w:t xml:space="preserve">a = b = 10.95 Å, c = 28.545 Å, γ = 120°; 15.7 Å vacuum</w:t>
             </w:r>
           </w:p>
         </w:tc>
@@ -617,7 +644,7 @@
                 <w:sz w:val="18"/>
                 <w:szCs w:val="18"/>
               </w:rPr>
-              <w:t xml:space="preserve">Stage-1 LiC₆, √3 × √3 R30°, 2 × 2 × 2; graphene-terminated; 108 atoms + 1 Li adatom</w:t>
+              <w:t xml:space="preserve">15 Å vacuum</w:t>
             </w:r>
           </w:p>
         </w:tc>
@@ -646,7 +673,7 @@
                 <w:sz w:val="18"/>
                 <w:szCs w:val="18"/>
               </w:rPr>
-              <w:t xml:space="preserve">Cell / vacuum</w:t>
+              <w:t xml:space="preserve">Fixed atoms</w:t>
             </w:r>
           </w:p>
         </w:tc>
@@ -673,7 +700,7 @@
                 <w:sz w:val="18"/>
                 <w:szCs w:val="18"/>
               </w:rPr>
-              <w:t xml:space="preserve">a = b = 10.95 Å, c = 28.545 Å, γ = 120°; 15.7 Å vacuum</w:t>
+              <w:t xml:space="preserve">Bottom two Li₂N/Li bilayers</w:t>
             </w:r>
           </w:p>
         </w:tc>
@@ -700,7 +727,7 @@
                 <w:sz w:val="18"/>
                 <w:szCs w:val="18"/>
               </w:rPr>
-              <w:t xml:space="preserve">15 Å vacuum</w:t>
+              <w:t xml:space="preserve">Bottom 50 % of the slab</w:t>
             </w:r>
           </w:p>
         </w:tc>
@@ -729,7 +756,7 @@
                 <w:sz w:val="18"/>
                 <w:szCs w:val="18"/>
               </w:rPr>
-              <w:t xml:space="preserve">Fixed atoms</w:t>
+              <w:t xml:space="preserve">Migration path</w:t>
             </w:r>
           </w:p>
         </w:tc>
@@ -756,7 +783,7 @@
                 <w:sz w:val="18"/>
                 <w:szCs w:val="18"/>
               </w:rPr>
-              <w:t xml:space="preserve">Bottom two Li₂N/Li bilayers</w:t>
+              <w:t xml:space="preserve">Constrained relaxation: adatom lateral (x, y) coordinates fixed; its height and all unconstrained atoms relaxed independently</w:t>
             </w:r>
           </w:p>
         </w:tc>
@@ -783,90 +810,7 @@
                 <w:sz w:val="18"/>
                 <w:szCs w:val="18"/>
               </w:rPr>
-              <w:t xml:space="preserve">Bottom 50 % of the slab</w:t>
-            </w:r>
-          </w:p>
-        </w:tc>
-      </w:tr>
-      <w:tr>
-        <w:tc>
-          <w:tcPr>
-            <w:tcW w:type="dxa" w:w="2280"/>
-            <w:gridSpan w:val="1"/>
-            <w:tcMar>
-              <w:top w:type="dxa" w:w="50"/>
-              <w:left w:type="dxa" w:w="100"/>
-              <w:bottom w:type="dxa" w:w="50"/>
-              <w:right w:type="dxa" w:w="100"/>
-            </w:tcMar>
-          </w:tcPr>
-          <w:p>
-            <w:pPr>
-              <w:spacing w:after="0" w:before="0"/>
-            </w:pPr>
-            <w:r>
-              <w:rPr>
-                <w:rFonts w:ascii="Times New Roman" w:cs="Times New Roman" w:eastAsia="Times New Roman" w:hAnsi="Times New Roman"/>
-                <w:b w:val="false"/>
-                <w:bCs w:val="false"/>
-                <w:sz w:val="18"/>
-                <w:szCs w:val="18"/>
-              </w:rPr>
-              <w:t xml:space="preserve">Migration path</w:t>
-            </w:r>
-          </w:p>
-        </w:tc>
-        <w:tc>
-          <w:tcPr>
-            <w:tcW w:type="dxa" w:w="3540"/>
-            <w:gridSpan w:val="1"/>
-            <w:tcMar>
-              <w:top w:type="dxa" w:w="50"/>
-              <w:left w:type="dxa" w:w="100"/>
-              <w:bottom w:type="dxa" w:w="50"/>
-              <w:right w:type="dxa" w:w="100"/>
-            </w:tcMar>
-          </w:tcPr>
-          <w:p>
-            <w:pPr>
-              <w:spacing w:after="0" w:before="0"/>
-            </w:pPr>
-            <w:r>
-              <w:rPr>
-                <w:rFonts w:ascii="Times New Roman" w:cs="Times New Roman" w:eastAsia="Times New Roman" w:hAnsi="Times New Roman"/>
-                <w:b w:val="false"/>
-                <w:bCs w:val="false"/>
-                <w:sz w:val="18"/>
-                <w:szCs w:val="18"/>
-              </w:rPr>
-              <w:t xml:space="preserve">Constrained relaxation: adatom lateral (x, y) coordinates fixed; its height and all unconstrained atoms relaxed independently</w:t>
-            </w:r>
-          </w:p>
-        </w:tc>
-        <w:tc>
-          <w:tcPr>
-            <w:tcW w:type="dxa" w:w="3540"/>
-            <w:gridSpan w:val="1"/>
-            <w:tcMar>
-              <w:top w:type="dxa" w:w="50"/>
-              <w:left w:type="dxa" w:w="100"/>
-              <w:bottom w:type="dxa" w:w="50"/>
-              <w:right w:type="dxa" w:w="100"/>
-            </w:tcMar>
-          </w:tcPr>
-          <w:p>
-            <w:pPr>
-              <w:spacing w:after="0" w:before="0"/>
-            </w:pPr>
-            <w:r>
-              <w:rPr>
-                <w:rFonts w:ascii="Times New Roman" w:cs="Times New Roman" w:eastAsia="Times New Roman" w:hAnsi="Times New Roman"/>
-                <w:b w:val="false"/>
-                <w:bCs w:val="false"/>
-                <w:sz w:val="18"/>
-                <w:szCs w:val="18"/>
-              </w:rPr>
-              <w:t xml:space="preserve">CI-NEB [8] with the UMA-oc20 machine-learned potential [10] (7 images, IDPP initial path [9], 0.05 eV Å⁻¹) as implemented in ASE [11], then DFT single-point energies on those geometries</w:t>
+              <w:t xml:space="preserve">CI-NEB [4] with the UMA-oc20 machine-learned potential [6] (7 images, IDPP initial path [5], 0.05 eV Å⁻¹) as implemented in ASE [7], then DFT single-point energies on those geometries</w:t>
             </w:r>
           </w:p>
         </w:tc>
@@ -1074,7 +1018,7 @@
           <w:sz w:val="18"/>
           <w:szCs w:val="18"/>
         </w:rPr>
-        <w:t xml:space="preserve">The LiC₆(0001) energies are DFT single points on machine-learned-potential geometries; because such potentials smooth the transition state, the LiC₆ barrier — and hence the barrier ratio quoted in the main text — is a conservative lower bound. The Li₃N(001) value of 0.118 eV agrees with the 0.133 eV reported for the same surface in ref. [12].</w:t>
+        <w:t xml:space="preserve">The LiC₆(0001) energies are DFT single points on machine-learned-potential geometries; because such potentials smooth the transition state, the LiC₆ barrier — and hence the barrier ratio quoted in the main text — is a conservative lower bound. The Li₃N(001) value of 0.118 eV agrees with the 0.133 eV reported for the same surface in ref. [8].</w:t>
       </w:r>
     </w:p>
     <w:p>
@@ -1128,7 +1072,7 @@
           <w:sz w:val="16"/>
           <w:szCs w:val="16"/>
         </w:rPr>
-        <w:t xml:space="preserve">[3] D. Vanderbilt, Soft self-consistent pseudopotentials in a generalized eigenvalue formalism, Phys. Rev. B 41 (1990) 7892–7895. https://doi.org/10.1103/PhysRevB.41.7892.</w:t>
+        <w:t xml:space="preserve">[3] N. Marzari, D. Vanderbilt, A. De Vita, M. C. Payne, Thermal contraction and disordering of the Al(110) surface, Phys. Rev. Lett. 82 (1999) 3296–3299. https://doi.org/10.1103/PhysRevLett.82.3296.</w:t>
       </w:r>
     </w:p>
     <w:p>
@@ -1141,7 +1085,7 @@
           <w:sz w:val="16"/>
           <w:szCs w:val="16"/>
         </w:rPr>
-        <w:t xml:space="preserve">[4] P. E. Blöchl, Projector augmented-wave method, Phys. Rev. B 50 (1994) 17953–17979. https://doi.org/10.1103/PhysRevB.50.17953.</w:t>
+        <w:t xml:space="preserve">[4] G. Henkelman, B. P. Uberuaga, H. Jónsson, A climbing image nudged elastic band method for finding saddle points and minimum energy paths, J. Chem. Phys. 113 (2000) 9901–9904. https://doi.org/10.1063/1.1329672.</w:t>
       </w:r>
     </w:p>
     <w:p>
@@ -1154,7 +1098,7 @@
           <w:sz w:val="16"/>
           <w:szCs w:val="16"/>
         </w:rPr>
-        <w:t xml:space="preserve">[5] K. F. Garrity, J. W. Bennett, K. M. Rabe, D. Vanderbilt, Pseudopotentials for high-throughput DFT calculations, Comput. Mater. Sci. 81 (2014) 446–452. https://doi.org/10.1016/j.commatsci.2013.08.053.</w:t>
+        <w:t xml:space="preserve">[5] S. Smidstrup, A. Pedersen, K. Stokbro, H. Jónsson, Improved initial guess for minimum energy path calculations, J. Chem. Phys. 140 (2014) 214106. https://doi.org/10.1063/1.4878664.</w:t>
       </w:r>
     </w:p>
     <w:p>
@@ -1167,7 +1111,7 @@
           <w:sz w:val="16"/>
           <w:szCs w:val="16"/>
         </w:rPr>
-        <w:t xml:space="preserve">[6] A. Dal Corso, Pseudopotentials periodic table: From H to Pu, Comput. Mater. Sci. 95 (2014) 337–350. https://doi.org/10.1016/j.commatsci.2014.07.043.</w:t>
+        <w:t xml:space="preserve">[6] B. M. Wood, M. Dzamba, X. Fu, M. Gao, M. Shuaibi, L. Barroso-Luque, K. Abdelmaqsoud, V. Gharakhanyan, J. R. Kitchin, D. S. Levine, K. Michel, A. Sriram, T. S. Cohen, A. Das, S. J. Sahoo, A. Rizvi, Z. W. Ulissi, C. L. Zitnick, UMA: A family of universal models for atoms, Adv. Neural Inf. Process. Syst. 38 (2025) 143528–143564. https://doi.org/10.52202/085713-4310.</w:t>
       </w:r>
     </w:p>
     <w:p>
@@ -1180,7 +1124,7 @@
           <w:sz w:val="16"/>
           <w:szCs w:val="16"/>
         </w:rPr>
-        <w:t xml:space="preserve">[7] N. Marzari, D. Vanderbilt, A. De Vita, M. C. Payne, Thermal contraction and disordering of the Al(110) surface, Phys. Rev. Lett. 82 (1999) 3296–3299. https://doi.org/10.1103/PhysRevLett.82.3296.</w:t>
+        <w:t xml:space="preserve">[7] A. H. Larsen, J. J. Mortensen, J. Blomqvist, I. E. Castelli, R. Christensen, M. Dułak, J. Friis, M. N. Groves, B. Hammer, C. Hargus, E. D. Hermes, P. C. Jennings, P. B. Jensen, J. Kermode, J. R. Kitchin, E. L. Kolsbjerg, J. Kubal, K. Kaasbjerg, S. Lysgaard, J. B. Maronsson, T. Maxson, T. Olsen, L. Pastewka, A. Peterson, C. Rostgaard, J. Schiøtz, O. Schütt, M. Strange, K. S. Thygesen, T. Vegge, L. Vilhelmsen, M. Walter, Z. Zeng, K. W. Jacobsen, The atomic simulation environment—a Python library for working with atoms, J. Phys.: Condens. Matter 29 (2017) 273002. https://doi.org/10.1088/1361-648X/aa680e.</w:t>
       </w:r>
     </w:p>
     <w:p>
@@ -1193,59 +1137,7 @@
           <w:sz w:val="16"/>
           <w:szCs w:val="16"/>
         </w:rPr>
-        <w:t xml:space="preserve">[8] G. Henkelman, B. P. Uberuaga, H. Jónsson, A climbing image nudged elastic band method for finding saddle points and minimum energy paths, J. Chem. Phys. 113 (2000) 9901–9904. https://doi.org/10.1063/1.1329672.</w:t>
-      </w:r>
-    </w:p>
-    <w:p>
-      <w:pPr>
-        <w:spacing w:after="40" w:before="0" w:line="280"/>
-      </w:pPr>
-      <w:r>
-        <w:rPr>
-          <w:rFonts w:ascii="Times New Roman" w:cs="Times New Roman" w:eastAsia="Times New Roman" w:hAnsi="Times New Roman"/>
-          <w:sz w:val="16"/>
-          <w:szCs w:val="16"/>
-        </w:rPr>
-        <w:t xml:space="preserve">[9] S. Smidstrup, A. Pedersen, K. Stokbro, H. Jónsson, Improved initial guess for minimum energy path calculations, J. Chem. Phys. 140 (2014) 214106. https://doi.org/10.1063/1.4878664.</w:t>
-      </w:r>
-    </w:p>
-    <w:p>
-      <w:pPr>
-        <w:spacing w:after="40" w:before="0" w:line="280"/>
-      </w:pPr>
-      <w:r>
-        <w:rPr>
-          <w:rFonts w:ascii="Times New Roman" w:cs="Times New Roman" w:eastAsia="Times New Roman" w:hAnsi="Times New Roman"/>
-          <w:sz w:val="16"/>
-          <w:szCs w:val="16"/>
-        </w:rPr>
-        <w:t xml:space="preserve">[10] B. M. Wood, M. Dzamba, X. Fu, M. Gao, M. Shuaibi, L. Barroso-Luque, K. Abdelmaqsoud, V. Gharakhanyan, J. R. Kitchin, D. S. Levine, K. Michel, A. Sriram, T. S. Cohen, A. Das, S. J. Sahoo, A. Rizvi, Z. W. Ulissi, C. L. Zitnick, UMA: A family of universal models for atoms, Adv. Neural Inf. Process. Syst. 38 (2025) 143528–143564. https://doi.org/10.52202/085713-4310.</w:t>
-      </w:r>
-    </w:p>
-    <w:p>
-      <w:pPr>
-        <w:spacing w:after="40" w:before="0" w:line="280"/>
-      </w:pPr>
-      <w:r>
-        <w:rPr>
-          <w:rFonts w:ascii="Times New Roman" w:cs="Times New Roman" w:eastAsia="Times New Roman" w:hAnsi="Times New Roman"/>
-          <w:sz w:val="16"/>
-          <w:szCs w:val="16"/>
-        </w:rPr>
-        <w:t xml:space="preserve">[11] A. H. Larsen, J. J. Mortensen, J. Blomqvist, I. E. Castelli, R. Christensen, M. Dułak, J. Friis, M. N. Groves, B. Hammer, C. Hargus, E. D. Hermes, P. C. Jennings, P. B. Jensen, J. Kermode, J. R. Kitchin, E. L. Kolsbjerg, J. Kubal, K. Kaasbjerg, S. Lysgaard, J. B. Maronsson, T. Maxson, T. Olsen, L. Pastewka, A. Peterson, C. Rostgaard, J. Schiøtz, O. Schütt, M. Strange, K. S. Thygesen, T. Vegge, L. Vilhelmsen, M. Walter, Z. Zeng, K. W. Jacobsen, The atomic simulation environment—a Python library for working with atoms, J. Phys.: Condens. Matter 29 (2017) 273002. https://doi.org/10.1088/1361-648X/aa680e.</w:t>
-      </w:r>
-    </w:p>
-    <w:p>
-      <w:pPr>
-        <w:spacing w:after="40" w:before="0" w:line="280"/>
-      </w:pPr>
-      <w:r>
-        <w:rPr>
-          <w:rFonts w:ascii="Times New Roman" w:cs="Times New Roman" w:eastAsia="Times New Roman" w:hAnsi="Times New Roman"/>
-          <w:sz w:val="16"/>
-          <w:szCs w:val="16"/>
-        </w:rPr>
-        <w:t xml:space="preserve">[12] M. S. Kim, Z. Zhang, J. Wang, S. T. Oyakhire, S. C. Kim, Z. Yu, Y. Chen, D. T. Boyle, Y. Ye, Z. Huang, W. Zhang, R. Xu, P. Sayavong, S. F. Bent, J. Qin, Z. Bao, Y. Cui, Revealing the multifunctions of Li3N in the suspension electrolyte for lithium metal batteries, ACS Nano 17 (2023) 3168–3180. https://doi.org/10.1021/acsnano.2c12470. (= ref. [54] of the main text)</w:t>
+        <w:t xml:space="preserve">[8] M. S. Kim, Z. Zhang, J. Wang, S. T. Oyakhire, S. C. Kim, Z. Yu, Y. Chen, D. T. Boyle, Y. Ye, Z. Huang, W. Zhang, R. Xu, P. Sayavong, S. F. Bent, J. Qin, Z. Bao, Y. Cui, Revealing the multifunctions of Li3N in the suspension electrolyte for lithium metal batteries, ACS Nano 17 (2023) 3168–3180. https://doi.org/10.1021/acsnano.2c12470. (= ref. [54] of the main text)</w:t>
       </w:r>
     </w:p>
     <w:sectPr>

</xml_diff>